<commit_message>
Unit 6 deliverables: refresh workbook + teacher-guide masters, add QC README
Rebuilds the two changed .docx masters into deliverables_unit6 so the committed
set matches the current build (self-scoring rubrics + web-app CTAs in the student
workbook; mirrored rubric + crosswalk in the teacher guide), and adds
README_QC_THIS_BUILD.md describing what changed, what automated QC passed, and the
render-confirm steps to run on a box with LibreOffice.

The teacher-guide PDF remains the pre-change render (sandbox cannot convert);
regenerate both PDFs via finish_unit6.sh.

Co-Authored-By: Claude Opus 4.8 <noreply@anthropic.com>
Claude-Session: https://claude.ai/code/session_01CqDWkh87qnzex6Px8WmVYN
</commit_message>
<xml_diff>
--- a/HistoryHack_Platinum/deliverables_unit6/Unit6_Teacher_HowToUse_and_MTSS_Guide.docx
+++ b/HistoryHack_Platinum/deliverables_unit6/Unit6_Teacher_HowToUse_and_MTSS_Guide.docx
@@ -15281,8 +15281,8 @@
                 <w:i w:val="false"/>
                 <w:iCs w:val="false"/>
                 <w:color w:val="C89B3C"/>
-                <w:sz w:val="16"/>
-                <w:szCs w:val="16"/>
+                <w:sz w:val="18"/>
+                <w:szCs w:val="18"/>
               </w:rPr>
               <w:t xml:space="preserve">PRIORITY TERM</w:t>
             </w:r>
@@ -16845,7 +16845,7 @@
                 <w:sz w:val="20"/>
                 <w:szCs w:val="20"/>
               </w:rPr>
-              <w:t xml:space="preserve">History lens on Rise and Spread of Fascism, Communism, and Totalitarianism: Fascism is characterized by ultranationalism (extreme devotion to nation above individual rights), authoritari…</w:t>
+              <w:t xml:space="preserve">History lens on Rise and Spread of Fascism, Communism, and Totalitarianism: Fascism is characterized by ultranationalism (extreme devotion to nation above individual rights), authoritarian leadership with dictatorial power concentrated in a single leader (Führer, Duce), and militarism glorifying war and aggressive expansion.</w:t>
             </w:r>
           </w:p>
         </w:tc>
@@ -16917,7 +16917,7 @@
                 <w:sz w:val="20"/>
                 <w:szCs w:val="20"/>
               </w:rPr>
-              <w:t xml:space="preserve">Politics/Government lens on Rise and Spread of Fascism, Communism, and Totalitarianism: Fascism is characterized by ultranationalism (extreme devotion to nation above individual rights), authoritari…</w:t>
+              <w:t xml:space="preserve">Politics/Government lens on Rise and Spread of Fascism, Communism, and Totalitarianism: Fascism is characterized by ultranationalism (extreme devotion to nation above individual rights), authoritarian leadership with dictatorial power concentrated in a single leader (Führer, Duce), and militarism glorifying war and aggressive expansion.</w:t>
             </w:r>
           </w:p>
         </w:tc>
@@ -17103,7 +17103,7 @@
                 <w:sz w:val="20"/>
                 <w:szCs w:val="20"/>
               </w:rPr>
-              <w:t xml:space="preserve">Politics/Government lens on FDR's Response to World Crises: As Japan invaded China and European tensions grew, Roosevelt faced strong isolationist sentiment reflected in …</w:t>
+              <w:t xml:space="preserve">Politics/Government lens on FDR's Response to World Crises: As Japan invaded China and European tensions grew, Roosevelt faced strong isolationist sentiment reflected in the Neutrality Acts (1935-1937).</w:t>
             </w:r>
           </w:p>
         </w:tc>
@@ -17175,7 +17175,7 @@
                 <w:sz w:val="20"/>
                 <w:szCs w:val="20"/>
               </w:rPr>
-              <w:t xml:space="preserve">History lens on FDR's Response to World Crises: As Japan invaded China and European tensions grew, Roosevelt faced strong isolationist sentiment reflected in …</w:t>
+              <w:t xml:space="preserve">History lens on FDR's Response to World Crises: As Japan invaded China and European tensions grew, Roosevelt faced strong isolationist sentiment reflected in the Neutrality Acts (1935-1937).</w:t>
             </w:r>
           </w:p>
         </w:tc>
@@ -17361,7 +17361,7 @@
                 <w:sz w:val="20"/>
                 <w:szCs w:val="20"/>
               </w:rPr>
-              <w:t xml:space="preserve">History lens on U.S. Response to the Holocaust: The National Origins Act (1924) limited immigration from Eastern and Southern Europe where most Jews lived. Th…</w:t>
+              <w:t xml:space="preserve">History lens on U.S. Response to the Holocaust: The National Origins Act (1924) limited immigration from Eastern and Southern Europe where most Jews lived.  The quota system severely restricted Jewish immigration, and U.S.</w:t>
             </w:r>
           </w:p>
         </w:tc>
@@ -17433,7 +17433,7 @@
                 <w:sz w:val="20"/>
                 <w:szCs w:val="20"/>
               </w:rPr>
-              <w:t xml:space="preserve">Culture lens on U.S. Response to the Holocaust: The National Origins Act (1924) limited immigration from Eastern and Southern Europe where most Jews lived. Th…</w:t>
+              <w:t xml:space="preserve">Culture lens on U.S. Response to the Holocaust: The National Origins Act (1924) limited immigration from Eastern and Southern Europe where most Jews lived.  The quota system severely restricted Jewish immigration, and U.S.</w:t>
             </w:r>
           </w:p>
         </w:tc>
@@ -17619,7 +17619,7 @@
                 <w:sz w:val="20"/>
                 <w:szCs w:val="20"/>
               </w:rPr>
-              <w:t xml:space="preserve">History lens on American Entry into World War II: German U-boats attacked U.S. ships carrying Lend-Lease supplies, leading to an undeclared naval war with the U…</w:t>
+              <w:t xml:space="preserve">History lens on American Entry into World War II: German U-boats attacked U.S.  ships carrying Lend-Lease supplies, leading to an undeclared naval war with the U.S.  Navy escorting convoys and engaging German submarines.</w:t>
             </w:r>
           </w:p>
         </w:tc>
@@ -17691,7 +17691,7 @@
                 <w:sz w:val="20"/>
                 <w:szCs w:val="20"/>
               </w:rPr>
-              <w:t xml:space="preserve">Politics/Government lens on American Entry into World War II: German U-boats attacked U.S. ships carrying Lend-Lease supplies, leading to an undeclared naval war with the U…</w:t>
+              <w:t xml:space="preserve">Politics/Government lens on American Entry into World War II: German U-boats attacked U.S.  ships carrying Lend-Lease supplies, leading to an undeclared naval war with the U.S.  Navy escorting convoys and engaging German submarines.</w:t>
             </w:r>
           </w:p>
         </w:tc>
@@ -17877,7 +17877,7 @@
                 <w:sz w:val="20"/>
                 <w:szCs w:val="20"/>
               </w:rPr>
-              <w:t xml:space="preserve">History lens on WWII Leaders &amp; Key Figures: Winston Churchill served as British Prime Minister (1940-1945), inspiring British resistance during the Battle…</w:t>
+              <w:t xml:space="preserve">History lens on WWII Leaders &amp; Key Figures: Winston Churchill served as British Prime Minister (1940-1945), inspiring British resistance during the Battle of Britain and partnering with FDR on the Atlantic Charter.</w:t>
             </w:r>
           </w:p>
         </w:tc>
@@ -17949,7 +17949,7 @@
                 <w:sz w:val="20"/>
                 <w:szCs w:val="20"/>
               </w:rPr>
-              <w:t xml:space="preserve">Politics/Government lens on WWII Leaders &amp; Key Figures: Winston Churchill served as British Prime Minister (1940-1945), inspiring British resistance during the Battle…</w:t>
+              <w:t xml:space="preserve">Politics/Government lens on WWII Leaders &amp; Key Figures: Winston Churchill served as British Prime Minister (1940-1945), inspiring British resistance during the Battle of Britain and partnering with FDR on the Atlantic Charter.</w:t>
             </w:r>
           </w:p>
         </w:tc>
@@ -18135,7 +18135,7 @@
                 <w:sz w:val="20"/>
                 <w:szCs w:val="20"/>
               </w:rPr>
-              <w:t xml:space="preserve">History lens on Major WWII Battles: Midway, Iwo Jima, Okinawa &amp; D-Day: Midway Atoll's strategic location in the central Pacific made it crucial for both Japanese expansion and Ameri…</w:t>
+              <w:t xml:space="preserve">History lens on Major WWII Battles: Midway, Iwo Jima, Okinawa &amp; D-Day: Midway Atoll's strategic location in the central Pacific made it crucial for both Japanese expansion and American defense.  U.S.  codebreakers broke Japanese naval codes, revealing attack plans.</w:t>
             </w:r>
           </w:p>
         </w:tc>
@@ -18207,7 +18207,7 @@
                 <w:sz w:val="20"/>
                 <w:szCs w:val="20"/>
               </w:rPr>
-              <w:t xml:space="preserve">Geography lens on Major WWII Battles: Midway, Iwo Jima, Okinawa &amp; D-Day: Midway Atoll's strategic location in the central Pacific made it crucial for both Japanese expansion and Ameri…</w:t>
+              <w:t xml:space="preserve">Geography lens on Major WWII Battles: Midway, Iwo Jima, Okinawa &amp; D-Day: Midway Atoll's strategic location in the central Pacific made it crucial for both Japanese expansion and American defense.  U.S.  codebreakers broke Japanese naval codes, revealing attack plans.</w:t>
             </w:r>
           </w:p>
         </w:tc>
@@ -18393,7 +18393,7 @@
                 <w:sz w:val="20"/>
                 <w:szCs w:val="20"/>
               </w:rPr>
-              <w:t xml:space="preserve">History lens on Special Fighting Forces in WWII: The Tuskegee Airmen were the first African American military aviators in the U.S. Armed Forces. Trained at Tus…</w:t>
+              <w:t xml:space="preserve">History lens on Special Fighting Forces in WWII: The Tuskegee Airmen were the first African American military aviators in the U.S.  Armed Forces.  Trained at Tuskegee Army Air Field in Alabama, the 332nd Fighter Group flew over 15,000 sorties in Europe and North Africa.</w:t>
             </w:r>
           </w:p>
         </w:tc>
@@ -18465,7 +18465,7 @@
                 <w:sz w:val="20"/>
                 <w:szCs w:val="20"/>
               </w:rPr>
-              <w:t xml:space="preserve">Culture lens on Special Fighting Forces in WWII: The Tuskegee Airmen were the first African American military aviators in the U.S. Armed Forces. Trained at Tus…</w:t>
+              <w:t xml:space="preserve">Culture lens on Special Fighting Forces in WWII: The Tuskegee Airmen were the first African American military aviators in the U.S.  Armed Forces.  Trained at Tuskegee Army Air Field in Alabama, the 332nd Fighter Group flew over 15,000 sorties in Europe and North Africa.</w:t>
             </w:r>
           </w:p>
         </w:tc>
@@ -18651,7 +18651,7 @@
                 <w:sz w:val="20"/>
                 <w:szCs w:val="20"/>
               </w:rPr>
-              <w:t xml:space="preserve">History lens on Women in World War II: With 16 million men serving in the armed forces, a massive labor shortage emerged as war production required d…</w:t>
+              <w:t xml:space="preserve">History lens on Women in World War II: With 16 million men serving in the armed forces, a massive labor shortage emerged as war production required doubling the manufacturing workforce.</w:t>
             </w:r>
           </w:p>
         </w:tc>
@@ -18723,7 +18723,7 @@
                 <w:sz w:val="20"/>
                 <w:szCs w:val="20"/>
               </w:rPr>
-              <w:t xml:space="preserve">Economics lens on Women in World War II: With 16 million men serving in the armed forces, a massive labor shortage emerged as war production required d…</w:t>
+              <w:t xml:space="preserve">Economics lens on Women in World War II: With 16 million men serving in the armed forces, a massive labor shortage emerged as war production required doubling the manufacturing workforce.</w:t>
             </w:r>
           </w:p>
         </w:tc>
@@ -18795,7 +18795,7 @@
                 <w:sz w:val="20"/>
                 <w:szCs w:val="20"/>
               </w:rPr>
-              <w:t xml:space="preserve">Culture lens on Women in World War II: With 16 million men serving in the armed forces, a massive labor shortage emerged as war production required d…</w:t>
+              <w:t xml:space="preserve">Culture lens on Women in World War II: With 16 million men serving in the armed forces, a massive labor shortage emerged as war production required doubling the manufacturing workforce.</w:t>
             </w:r>
           </w:p>
         </w:tc>
@@ -18981,7 +18981,7 @@
                 <w:sz w:val="20"/>
                 <w:szCs w:val="20"/>
               </w:rPr>
-              <w:t xml:space="preserve">History lens on African Americans in WWII: 1.5 million African Americans moved North and West during the 1940s to cities like Detroit, Chicago, and Los A…</w:t>
+              <w:t xml:space="preserve">History lens on African Americans in WWII: 1.5 million African Americans moved North and West during the 1940s to cities like Detroit, Chicago, and Los Angeles.  Defense industries offered higher wages than Southern agriculture, and average Black family income doubled during the war.</w:t>
             </w:r>
           </w:p>
         </w:tc>
@@ -19053,7 +19053,7 @@
                 <w:sz w:val="20"/>
                 <w:szCs w:val="20"/>
               </w:rPr>
-              <w:t xml:space="preserve">Culture lens on African Americans in WWII: 1.5 million African Americans moved North and West during the 1940s to cities like Detroit, Chicago, and Los A…</w:t>
+              <w:t xml:space="preserve">Culture lens on African Americans in WWII: 1.5 million African Americans moved North and West during the 1940s to cities like Detroit, Chicago, and Los Angeles.  Defense industries offered higher wages than Southern agriculture, and average Black family income doubled during the war.</w:t>
             </w:r>
           </w:p>
         </w:tc>
@@ -19125,7 +19125,7 @@
                 <w:sz w:val="20"/>
                 <w:szCs w:val="20"/>
               </w:rPr>
-              <w:t xml:space="preserve">Economics lens on African Americans in WWII: 1.5 million African Americans moved North and West during the 1940s to cities like Detroit, Chicago, and Los A…</w:t>
+              <w:t xml:space="preserve">Economics lens on African Americans in WWII: 1.5 million African Americans moved North and West during the 1940s to cities like Detroit, Chicago, and Los Angeles.  Defense industries offered higher wages than Southern agriculture, and average Black family income doubled during the war.</w:t>
             </w:r>
           </w:p>
         </w:tc>
@@ -19311,7 +19311,7 @@
                 <w:sz w:val="20"/>
                 <w:szCs w:val="20"/>
               </w:rPr>
-              <w:t xml:space="preserve">Culture lens on Japanese American Internment &amp; Korematsu: Following Pearl Harbor, Executive Order 9066 (February 1942) authorized removal of persons from designated mil…</w:t>
+              <w:t xml:space="preserve">Culture lens on Japanese American Internment &amp; Korematsu: Following Pearl Harbor, Executive Order 9066 (February 1942) authorized removal of persons from designated military areas, leading to internment of approximately 120,000 Japanese Americans—two-thirds of whom were U.S.</w:t>
             </w:r>
           </w:p>
         </w:tc>
@@ -19383,7 +19383,7 @@
                 <w:sz w:val="20"/>
                 <w:szCs w:val="20"/>
               </w:rPr>
-              <w:t xml:space="preserve">History lens on Japanese American Internment &amp; Korematsu: Following Pearl Harbor, Executive Order 9066 (February 1942) authorized removal of persons from designated mil…</w:t>
+              <w:t xml:space="preserve">History lens on Japanese American Internment &amp; Korematsu: Following Pearl Harbor, Executive Order 9066 (February 1942) authorized removal of persons from designated military areas, leading to internment of approximately 120,000 Japanese Americans—two-thirds of whom were U.S.</w:t>
             </w:r>
           </w:p>
         </w:tc>
@@ -19569,7 +19569,7 @@
                 <w:sz w:val="20"/>
                 <w:szCs w:val="20"/>
               </w:rPr>
-              <w:t xml:space="preserve">History lens on Home Front Mobilization: Ration books with coupons controlled civilian access to gasoline, tires, sugar, meat, coffee, and other commod…</w:t>
+              <w:t xml:space="preserve">History lens on Home Front Mobilization: Ration books with coupons controlled civilian access to gasoline, tires, sugar, meat, coffee, and other commodities.  This ensured military supplies while distributing scarce goods fairly.</w:t>
             </w:r>
           </w:p>
         </w:tc>
@@ -19641,7 +19641,7 @@
                 <w:sz w:val="20"/>
                 <w:szCs w:val="20"/>
               </w:rPr>
-              <w:t xml:space="preserve">Economics lens on Home Front Mobilization: Ration books with coupons controlled civilian access to gasoline, tires, sugar, meat, coffee, and other commod…</w:t>
+              <w:t xml:space="preserve">Economics lens on Home Front Mobilization: Ration books with coupons controlled civilian access to gasoline, tires, sugar, meat, coffee, and other commodities.  This ensured military supplies while distributing scarce goods fairly.</w:t>
             </w:r>
           </w:p>
         </w:tc>
@@ -19827,7 +19827,7 @@
                 <w:sz w:val="20"/>
                 <w:szCs w:val="20"/>
               </w:rPr>
-              <w:t xml:space="preserve">History lens on Manhattan Project &amp; Atomic Bomb: Oak Ridge was selected for uranium enrichment because of its remote location providing security isolation, abu…</w:t>
+              <w:t xml:space="preserve">History lens on Manhattan Project &amp; Atomic Bomb: Oak Ridge was selected for uranium enrichment because of its remote location providing security isolation, abundant electrical power from TVA, good transportation access, and available land.</w:t>
             </w:r>
           </w:p>
         </w:tc>
@@ -19899,7 +19899,7 @@
                 <w:sz w:val="20"/>
                 <w:szCs w:val="20"/>
               </w:rPr>
-              <w:t xml:space="preserve">Geography lens on Manhattan Project &amp; Atomic Bomb: Oak Ridge was selected for uranium enrichment because of its remote location providing security isolation, abu…</w:t>
+              <w:t xml:space="preserve">Geography lens on Manhattan Project &amp; Atomic Bomb: Oak Ridge was selected for uranium enrichment because of its remote location providing security isolation, abundant electrical power from TVA, good transportation access, and available land.</w:t>
             </w:r>
           </w:p>
         </w:tc>
@@ -20085,7 +20085,7 @@
                 <w:sz w:val="20"/>
                 <w:szCs w:val="20"/>
               </w:rPr>
-              <w:t xml:space="preserve">Politics/Government lens on Yalta and Potsdam Conferences: Roosevelt, Churchill, and Stalin met as Allied victory approached. Major agreements included UN formation plan…</w:t>
+              <w:t xml:space="preserve">Politics/Government lens on Yalta and Potsdam Conferences: Roosevelt, Churchill, and Stalin met as Allied victory approached.  Major agreements included UN formation plans, division of Germany into occupation zones, and Soviet entry into the war against Japan.</w:t>
             </w:r>
           </w:p>
         </w:tc>
@@ -20157,7 +20157,7 @@
                 <w:sz w:val="20"/>
                 <w:szCs w:val="20"/>
               </w:rPr>
-              <w:t xml:space="preserve">History lens on Yalta and Potsdam Conferences: Roosevelt, Churchill, and Stalin met as Allied victory approached. Major agreements included UN formation plan…</w:t>
+              <w:t xml:space="preserve">History lens on Yalta and Potsdam Conferences: Roosevelt, Churchill, and Stalin met as Allied victory approached.  Major agreements included UN formation plans, division of Germany into occupation zones, and Soviet entry into the war against Japan.</w:t>
             </w:r>
           </w:p>
         </w:tc>
@@ -20343,7 +20343,7 @@
                 <w:sz w:val="20"/>
                 <w:szCs w:val="20"/>
               </w:rPr>
-              <w:t xml:space="preserve">Politics/Government lens on Founding of the United Nations &amp; Cordell Hull: The League of Nations failed because the United States never joined, it lacked enforcement mechanisms, major p…</w:t>
+              <w:t xml:space="preserve">Politics/Government lens on Founding of the United Nations &amp; Cordell Hull: The League of Nations failed because the United States never joined, it lacked enforcement mechanisms, major powers could ignore it, and it couldn't prevent aggression by Germany, Italy, and Japan.</w:t>
             </w:r>
           </w:p>
         </w:tc>
@@ -20415,7 +20415,7 @@
                 <w:sz w:val="20"/>
                 <w:szCs w:val="20"/>
               </w:rPr>
-              <w:t xml:space="preserve">Culture lens on Founding of the United Nations &amp; Cordell Hull: The League of Nations failed because the United States never joined, it lacked enforcement mechanisms, major p…</w:t>
+              <w:t xml:space="preserve">Culture lens on Founding of the United Nations &amp; Cordell Hull: The League of Nations failed because the United States never joined, it lacked enforcement mechanisms, major powers could ignore it, and it couldn't prevent aggression by Germany, Italy, and Japan.</w:t>
             </w:r>
           </w:p>
         </w:tc>
@@ -20487,7 +20487,7 @@
                 <w:sz w:val="20"/>
                 <w:szCs w:val="20"/>
               </w:rPr>
-              <w:t xml:space="preserve">History lens on Founding of the United Nations &amp; Cordell Hull: The League of Nations failed because the United States never joined, it lacked enforcement mechanisms, major p…</w:t>
+              <w:t xml:space="preserve">History lens on Founding of the United Nations &amp; Cordell Hull: The League of Nations failed because the United States never joined, it lacked enforcement mechanisms, major powers could ignore it, and it couldn't prevent aggression by Germany, Italy, and Japan.</w:t>
             </w:r>
           </w:p>
         </w:tc>
@@ -20515,7 +20515,7 @@
           <w:sz w:val="36"/>
           <w:szCs w:val="36"/>
         </w:rPr>
-        <w:t xml:space="preserve">15. Constructed Response (CER) — 6-Point Rubric</w:t>
+        <w:t xml:space="preserve">15. Constructed Response — Student Self-Score, the Web-App Check, and Your 6-Point Scale</w:t>
       </w:r>
     </w:p>
     <w:p>
@@ -20533,7 +20533,909 @@
           <w:sz w:val="22"/>
           <w:szCs w:val="22"/>
         </w:rPr>
-        <w:t xml:space="preserve">The course’s canonical constructed-response scale. Student materials use the simple Full / Developing / Beginning per part; teachers score with the 6-point guide below (aligns with the DBQ/CER rubric bank).</w:t>
+        <w:t xml:space="preserve">One rubric, three views. Students now SELF-SCORE every constructed response — the CER (Activity 7), the HIPPO source analysis (Activity 5), and the final reflection — on the 4-level grid below, the SAME grid built into the History Hack web app. They then type the response into the app for instant feedback and compare the app’s score to their own. You score holistically on the 6-point scale; the crosswalk reconciles the two.</w:t>
+      </w:r>
+    </w:p>
+    <w:p>
+      <w:pPr>
+        <w:pStyle w:val="Heading2"/>
+        <w:keepNext/>
+        <w:spacing w:after="90" w:before="150"/>
+      </w:pPr>
+      <w:r>
+        <w:rPr>
+          <w:rFonts w:ascii="Calibri" w:cs="Calibri" w:eastAsia="Calibri" w:hAnsi="Calibri"/>
+          <w:b/>
+          <w:bCs/>
+          <w:i w:val="false"/>
+          <w:iCs w:val="false"/>
+          <w:color w:val="1B2A4A"/>
+          <w:sz w:val="28"/>
+          <w:szCs w:val="28"/>
+        </w:rPr>
+        <w:t xml:space="preserve">15a. The student self-scoring rubric (identical in the workbook and the web app)</w:t>
+      </w:r>
+    </w:p>
+    <w:p>
+      <w:pPr>
+        <w:spacing w:after="100"/>
+      </w:pPr>
+      <w:r>
+        <w:rPr>
+          <w:rFonts w:ascii="Calibri" w:cs="Calibri" w:eastAsia="Calibri" w:hAnsi="Calibri"/>
+          <w:b w:val="false"/>
+          <w:bCs w:val="false"/>
+          <w:i/>
+          <w:iCs/>
+          <w:color w:val="6B7280"/>
+          <w:sz w:val="20"/>
+          <w:szCs w:val="20"/>
+        </w:rPr>
+        <w:t xml:space="preserve">This is exactly what the student marks on the page after each constructed response. Each dimension is scored 4–1; the three add to a total out of 12.</w:t>
+      </w:r>
+    </w:p>
+    <w:tbl>
+      <w:tblPr>
+        <w:tblW w:type="dxa" w:w="9648"/>
+        <w:tblBorders>
+          <w:top w:val="single" w:color="auto" w:sz="4"/>
+          <w:left w:val="single" w:color="auto" w:sz="4"/>
+          <w:bottom w:val="single" w:color="auto" w:sz="4"/>
+          <w:right w:val="single" w:color="auto" w:sz="4"/>
+          <w:insideH w:val="single" w:color="auto" w:sz="4"/>
+          <w:insideV w:val="single" w:color="auto" w:sz="4"/>
+        </w:tblBorders>
+      </w:tblPr>
+      <w:tblGrid>
+        <w:gridCol w:w="1748"/>
+        <w:gridCol w:w="2100"/>
+        <w:gridCol w:w="1800"/>
+        <w:gridCol w:w="1800"/>
+        <w:gridCol w:w="2200"/>
+      </w:tblGrid>
+      <w:tr>
+        <w:trPr>
+          <w:tblHeader/>
+        </w:trPr>
+        <w:tc>
+          <w:tcPr>
+            <w:tcW w:type="dxa" w:w="1748"/>
+            <w:tcBorders>
+              <w:top w:val="single" w:color="D9D5C8" w:sz="4"/>
+              <w:left w:val="single" w:color="D9D5C8" w:sz="4"/>
+              <w:bottom w:val="single" w:color="D9D5C8" w:sz="4"/>
+              <w:right w:val="single" w:color="D9D5C8" w:sz="4"/>
+            </w:tcBorders>
+            <w:shd w:fill="1B2A4A" w:color="auto" w:val="clear"/>
+            <w:tcMar>
+              <w:top w:type="dxa" w:w="60"/>
+              <w:left w:type="dxa" w:w="110"/>
+              <w:bottom w:type="dxa" w:w="60"/>
+              <w:right w:type="dxa" w:w="110"/>
+            </w:tcMar>
+          </w:tcPr>
+          <w:p>
+            <w:pPr>
+              <w:spacing w:after="0"/>
+            </w:pPr>
+            <w:r>
+              <w:rPr>
+                <w:rFonts w:ascii="Calibri" w:cs="Calibri" w:eastAsia="Calibri" w:hAnsi="Calibri"/>
+                <w:b/>
+                <w:bCs/>
+                <w:i w:val="false"/>
+                <w:iCs w:val="false"/>
+                <w:color w:val="FFFFFF"/>
+                <w:sz w:val="19"/>
+                <w:szCs w:val="19"/>
+              </w:rPr>
+              <w:t xml:space="preserve">Part</w:t>
+            </w:r>
+          </w:p>
+        </w:tc>
+        <w:tc>
+          <w:tcPr>
+            <w:tcW w:type="dxa" w:w="2100"/>
+            <w:tcBorders>
+              <w:top w:val="single" w:color="D9D5C8" w:sz="4"/>
+              <w:left w:val="single" w:color="D9D5C8" w:sz="4"/>
+              <w:bottom w:val="single" w:color="D9D5C8" w:sz="4"/>
+              <w:right w:val="single" w:color="D9D5C8" w:sz="4"/>
+            </w:tcBorders>
+            <w:shd w:fill="1B2A4A" w:color="auto" w:val="clear"/>
+            <w:tcMar>
+              <w:top w:type="dxa" w:w="60"/>
+              <w:left w:type="dxa" w:w="110"/>
+              <w:bottom w:type="dxa" w:w="60"/>
+              <w:right w:type="dxa" w:w="110"/>
+            </w:tcMar>
+          </w:tcPr>
+          <w:p>
+            <w:pPr>
+              <w:spacing w:after="0"/>
+            </w:pPr>
+            <w:r>
+              <w:rPr>
+                <w:rFonts w:ascii="Calibri" w:cs="Calibri" w:eastAsia="Calibri" w:hAnsi="Calibri"/>
+                <w:b/>
+                <w:bCs/>
+                <w:i w:val="false"/>
+                <w:iCs w:val="false"/>
+                <w:color w:val="FFFFFF"/>
+                <w:sz w:val="19"/>
+                <w:szCs w:val="19"/>
+              </w:rPr>
+              <w:t xml:space="preserve">4 · Strong</w:t>
+            </w:r>
+          </w:p>
+        </w:tc>
+        <w:tc>
+          <w:tcPr>
+            <w:tcW w:type="dxa" w:w="1800"/>
+            <w:tcBorders>
+              <w:top w:val="single" w:color="D9D5C8" w:sz="4"/>
+              <w:left w:val="single" w:color="D9D5C8" w:sz="4"/>
+              <w:bottom w:val="single" w:color="D9D5C8" w:sz="4"/>
+              <w:right w:val="single" w:color="D9D5C8" w:sz="4"/>
+            </w:tcBorders>
+            <w:shd w:fill="1B2A4A" w:color="auto" w:val="clear"/>
+            <w:tcMar>
+              <w:top w:type="dxa" w:w="60"/>
+              <w:left w:type="dxa" w:w="110"/>
+              <w:bottom w:type="dxa" w:w="60"/>
+              <w:right w:type="dxa" w:w="110"/>
+            </w:tcMar>
+          </w:tcPr>
+          <w:p>
+            <w:pPr>
+              <w:spacing w:after="0"/>
+            </w:pPr>
+            <w:r>
+              <w:rPr>
+                <w:rFonts w:ascii="Calibri" w:cs="Calibri" w:eastAsia="Calibri" w:hAnsi="Calibri"/>
+                <w:b/>
+                <w:bCs/>
+                <w:i w:val="false"/>
+                <w:iCs w:val="false"/>
+                <w:color w:val="FFFFFF"/>
+                <w:sz w:val="19"/>
+                <w:szCs w:val="19"/>
+              </w:rPr>
+              <w:t xml:space="preserve">3 · Proficient</w:t>
+            </w:r>
+          </w:p>
+        </w:tc>
+        <w:tc>
+          <w:tcPr>
+            <w:tcW w:type="dxa" w:w="1800"/>
+            <w:tcBorders>
+              <w:top w:val="single" w:color="D9D5C8" w:sz="4"/>
+              <w:left w:val="single" w:color="D9D5C8" w:sz="4"/>
+              <w:bottom w:val="single" w:color="D9D5C8" w:sz="4"/>
+              <w:right w:val="single" w:color="D9D5C8" w:sz="4"/>
+            </w:tcBorders>
+            <w:shd w:fill="1B2A4A" w:color="auto" w:val="clear"/>
+            <w:tcMar>
+              <w:top w:type="dxa" w:w="60"/>
+              <w:left w:type="dxa" w:w="110"/>
+              <w:bottom w:type="dxa" w:w="60"/>
+              <w:right w:type="dxa" w:w="110"/>
+            </w:tcMar>
+          </w:tcPr>
+          <w:p>
+            <w:pPr>
+              <w:spacing w:after="0"/>
+            </w:pPr>
+            <w:r>
+              <w:rPr>
+                <w:rFonts w:ascii="Calibri" w:cs="Calibri" w:eastAsia="Calibri" w:hAnsi="Calibri"/>
+                <w:b/>
+                <w:bCs/>
+                <w:i w:val="false"/>
+                <w:iCs w:val="false"/>
+                <w:color w:val="FFFFFF"/>
+                <w:sz w:val="19"/>
+                <w:szCs w:val="19"/>
+              </w:rPr>
+              <w:t xml:space="preserve">2 · Developing</w:t>
+            </w:r>
+          </w:p>
+        </w:tc>
+        <w:tc>
+          <w:tcPr>
+            <w:tcW w:type="dxa" w:w="2200"/>
+            <w:tcBorders>
+              <w:top w:val="single" w:color="D9D5C8" w:sz="4"/>
+              <w:left w:val="single" w:color="D9D5C8" w:sz="4"/>
+              <w:bottom w:val="single" w:color="D9D5C8" w:sz="4"/>
+              <w:right w:val="single" w:color="D9D5C8" w:sz="4"/>
+            </w:tcBorders>
+            <w:shd w:fill="1B2A4A" w:color="auto" w:val="clear"/>
+            <w:tcMar>
+              <w:top w:type="dxa" w:w="60"/>
+              <w:left w:type="dxa" w:w="110"/>
+              <w:bottom w:type="dxa" w:w="60"/>
+              <w:right w:type="dxa" w:w="110"/>
+            </w:tcMar>
+          </w:tcPr>
+          <w:p>
+            <w:pPr>
+              <w:spacing w:after="0"/>
+            </w:pPr>
+            <w:r>
+              <w:rPr>
+                <w:rFonts w:ascii="Calibri" w:cs="Calibri" w:eastAsia="Calibri" w:hAnsi="Calibri"/>
+                <w:b/>
+                <w:bCs/>
+                <w:i w:val="false"/>
+                <w:iCs w:val="false"/>
+                <w:color w:val="FFFFFF"/>
+                <w:sz w:val="19"/>
+                <w:szCs w:val="19"/>
+              </w:rPr>
+              <w:t xml:space="preserve">1 · Beginning</w:t>
+            </w:r>
+          </w:p>
+        </w:tc>
+      </w:tr>
+      <w:tr>
+        <w:tc>
+          <w:tcPr>
+            <w:tcW w:type="dxa" w:w="1748"/>
+            <w:tcBorders>
+              <w:top w:val="single" w:color="D9D5C8" w:sz="4"/>
+              <w:left w:val="single" w:color="D9D5C8" w:sz="4"/>
+              <w:bottom w:val="single" w:color="D9D5C8" w:sz="4"/>
+              <w:right w:val="single" w:color="D9D5C8" w:sz="4"/>
+            </w:tcBorders>
+            <w:tcMar>
+              <w:top w:type="dxa" w:w="60"/>
+              <w:left w:type="dxa" w:w="110"/>
+              <w:bottom w:type="dxa" w:w="60"/>
+              <w:right w:type="dxa" w:w="110"/>
+            </w:tcMar>
+          </w:tcPr>
+          <w:p>
+            <w:pPr>
+              <w:spacing w:after="0"/>
+            </w:pPr>
+            <w:r>
+              <w:rPr>
+                <w:rFonts w:ascii="Calibri" w:cs="Calibri" w:eastAsia="Calibri" w:hAnsi="Calibri"/>
+                <w:b w:val="false"/>
+                <w:bCs w:val="false"/>
+                <w:i w:val="false"/>
+                <w:iCs w:val="false"/>
+                <w:color w:val="1A1A1A"/>
+                <w:sz w:val="20"/>
+                <w:szCs w:val="20"/>
+              </w:rPr>
+              <w:t xml:space="preserve">Claim</w:t>
+            </w:r>
+          </w:p>
+        </w:tc>
+        <w:tc>
+          <w:tcPr>
+            <w:tcW w:type="dxa" w:w="2100"/>
+            <w:tcBorders>
+              <w:top w:val="single" w:color="D9D5C8" w:sz="4"/>
+              <w:left w:val="single" w:color="D9D5C8" w:sz="4"/>
+              <w:bottom w:val="single" w:color="D9D5C8" w:sz="4"/>
+              <w:right w:val="single" w:color="D9D5C8" w:sz="4"/>
+            </w:tcBorders>
+            <w:tcMar>
+              <w:top w:type="dxa" w:w="60"/>
+              <w:left w:type="dxa" w:w="110"/>
+              <w:bottom w:type="dxa" w:w="60"/>
+              <w:right w:type="dxa" w:w="110"/>
+            </w:tcMar>
+          </w:tcPr>
+          <w:p>
+            <w:pPr>
+              <w:spacing w:after="0"/>
+            </w:pPr>
+            <w:r>
+              <w:rPr>
+                <w:rFonts w:ascii="Calibri" w:cs="Calibri" w:eastAsia="Calibri" w:hAnsi="Calibri"/>
+                <w:b w:val="false"/>
+                <w:bCs w:val="false"/>
+                <w:i w:val="false"/>
+                <w:iCs w:val="false"/>
+                <w:color w:val="1A1A1A"/>
+                <w:sz w:val="20"/>
+                <w:szCs w:val="20"/>
+              </w:rPr>
+              <w:t xml:space="preserve">Precise, defensible</w:t>
+            </w:r>
+          </w:p>
+        </w:tc>
+        <w:tc>
+          <w:tcPr>
+            <w:tcW w:type="dxa" w:w="1800"/>
+            <w:tcBorders>
+              <w:top w:val="single" w:color="D9D5C8" w:sz="4"/>
+              <w:left w:val="single" w:color="D9D5C8" w:sz="4"/>
+              <w:bottom w:val="single" w:color="D9D5C8" w:sz="4"/>
+              <w:right w:val="single" w:color="D9D5C8" w:sz="4"/>
+            </w:tcBorders>
+            <w:tcMar>
+              <w:top w:type="dxa" w:w="60"/>
+              <w:left w:type="dxa" w:w="110"/>
+              <w:bottom w:type="dxa" w:w="60"/>
+              <w:right w:type="dxa" w:w="110"/>
+            </w:tcMar>
+          </w:tcPr>
+          <w:p>
+            <w:pPr>
+              <w:spacing w:after="0"/>
+            </w:pPr>
+            <w:r>
+              <w:rPr>
+                <w:rFonts w:ascii="Calibri" w:cs="Calibri" w:eastAsia="Calibri" w:hAnsi="Calibri"/>
+                <w:b w:val="false"/>
+                <w:bCs w:val="false"/>
+                <w:i w:val="false"/>
+                <w:iCs w:val="false"/>
+                <w:color w:val="1A1A1A"/>
+                <w:sz w:val="20"/>
+                <w:szCs w:val="20"/>
+              </w:rPr>
+              <w:t xml:space="preserve">Clear</w:t>
+            </w:r>
+          </w:p>
+        </w:tc>
+        <w:tc>
+          <w:tcPr>
+            <w:tcW w:type="dxa" w:w="1800"/>
+            <w:tcBorders>
+              <w:top w:val="single" w:color="D9D5C8" w:sz="4"/>
+              <w:left w:val="single" w:color="D9D5C8" w:sz="4"/>
+              <w:bottom w:val="single" w:color="D9D5C8" w:sz="4"/>
+              <w:right w:val="single" w:color="D9D5C8" w:sz="4"/>
+            </w:tcBorders>
+            <w:tcMar>
+              <w:top w:type="dxa" w:w="60"/>
+              <w:left w:type="dxa" w:w="110"/>
+              <w:bottom w:type="dxa" w:w="60"/>
+              <w:right w:type="dxa" w:w="110"/>
+            </w:tcMar>
+          </w:tcPr>
+          <w:p>
+            <w:pPr>
+              <w:spacing w:after="0"/>
+            </w:pPr>
+            <w:r>
+              <w:rPr>
+                <w:rFonts w:ascii="Calibri" w:cs="Calibri" w:eastAsia="Calibri" w:hAnsi="Calibri"/>
+                <w:b w:val="false"/>
+                <w:bCs w:val="false"/>
+                <w:i w:val="false"/>
+                <w:iCs w:val="false"/>
+                <w:color w:val="1A1A1A"/>
+                <w:sz w:val="20"/>
+                <w:szCs w:val="20"/>
+              </w:rPr>
+              <w:t xml:space="preserve">General</w:t>
+            </w:r>
+          </w:p>
+        </w:tc>
+        <w:tc>
+          <w:tcPr>
+            <w:tcW w:type="dxa" w:w="2200"/>
+            <w:tcBorders>
+              <w:top w:val="single" w:color="D9D5C8" w:sz="4"/>
+              <w:left w:val="single" w:color="D9D5C8" w:sz="4"/>
+              <w:bottom w:val="single" w:color="D9D5C8" w:sz="4"/>
+              <w:right w:val="single" w:color="D9D5C8" w:sz="4"/>
+            </w:tcBorders>
+            <w:tcMar>
+              <w:top w:type="dxa" w:w="60"/>
+              <w:left w:type="dxa" w:w="110"/>
+              <w:bottom w:type="dxa" w:w="60"/>
+              <w:right w:type="dxa" w:w="110"/>
+            </w:tcMar>
+          </w:tcPr>
+          <w:p>
+            <w:pPr>
+              <w:spacing w:after="0"/>
+            </w:pPr>
+            <w:r>
+              <w:rPr>
+                <w:rFonts w:ascii="Calibri" w:cs="Calibri" w:eastAsia="Calibri" w:hAnsi="Calibri"/>
+                <w:b w:val="false"/>
+                <w:bCs w:val="false"/>
+                <w:i w:val="false"/>
+                <w:iCs w:val="false"/>
+                <w:color w:val="1A1A1A"/>
+                <w:sz w:val="20"/>
+                <w:szCs w:val="20"/>
+              </w:rPr>
+              <w:t xml:space="preserve">Unclear / missing</w:t>
+            </w:r>
+          </w:p>
+        </w:tc>
+      </w:tr>
+      <w:tr>
+        <w:tc>
+          <w:tcPr>
+            <w:tcW w:type="dxa" w:w="1748"/>
+            <w:tcBorders>
+              <w:top w:val="single" w:color="D9D5C8" w:sz="4"/>
+              <w:left w:val="single" w:color="D9D5C8" w:sz="4"/>
+              <w:bottom w:val="single" w:color="D9D5C8" w:sz="4"/>
+              <w:right w:val="single" w:color="D9D5C8" w:sz="4"/>
+            </w:tcBorders>
+            <w:tcMar>
+              <w:top w:type="dxa" w:w="60"/>
+              <w:left w:type="dxa" w:w="110"/>
+              <w:bottom w:type="dxa" w:w="60"/>
+              <w:right w:type="dxa" w:w="110"/>
+            </w:tcMar>
+          </w:tcPr>
+          <w:p>
+            <w:pPr>
+              <w:spacing w:after="0"/>
+            </w:pPr>
+            <w:r>
+              <w:rPr>
+                <w:rFonts w:ascii="Calibri" w:cs="Calibri" w:eastAsia="Calibri" w:hAnsi="Calibri"/>
+                <w:b w:val="false"/>
+                <w:bCs w:val="false"/>
+                <w:i w:val="false"/>
+                <w:iCs w:val="false"/>
+                <w:color w:val="1A1A1A"/>
+                <w:sz w:val="20"/>
+                <w:szCs w:val="20"/>
+              </w:rPr>
+              <w:t xml:space="preserve">Evidence</w:t>
+            </w:r>
+          </w:p>
+        </w:tc>
+        <w:tc>
+          <w:tcPr>
+            <w:tcW w:type="dxa" w:w="2100"/>
+            <w:tcBorders>
+              <w:top w:val="single" w:color="D9D5C8" w:sz="4"/>
+              <w:left w:val="single" w:color="D9D5C8" w:sz="4"/>
+              <w:bottom w:val="single" w:color="D9D5C8" w:sz="4"/>
+              <w:right w:val="single" w:color="D9D5C8" w:sz="4"/>
+            </w:tcBorders>
+            <w:tcMar>
+              <w:top w:type="dxa" w:w="60"/>
+              <w:left w:type="dxa" w:w="110"/>
+              <w:bottom w:type="dxa" w:w="60"/>
+              <w:right w:type="dxa" w:w="110"/>
+            </w:tcMar>
+          </w:tcPr>
+          <w:p>
+            <w:pPr>
+              <w:spacing w:after="0"/>
+            </w:pPr>
+            <w:r>
+              <w:rPr>
+                <w:rFonts w:ascii="Calibri" w:cs="Calibri" w:eastAsia="Calibri" w:hAnsi="Calibri"/>
+                <w:b w:val="false"/>
+                <w:bCs w:val="false"/>
+                <w:i w:val="false"/>
+                <w:iCs w:val="false"/>
+                <w:color w:val="1A1A1A"/>
+                <w:sz w:val="20"/>
+                <w:szCs w:val="20"/>
+              </w:rPr>
+              <w:t xml:space="preserve">2+ accurate, specific</w:t>
+            </w:r>
+          </w:p>
+        </w:tc>
+        <w:tc>
+          <w:tcPr>
+            <w:tcW w:type="dxa" w:w="1800"/>
+            <w:tcBorders>
+              <w:top w:val="single" w:color="D9D5C8" w:sz="4"/>
+              <w:left w:val="single" w:color="D9D5C8" w:sz="4"/>
+              <w:bottom w:val="single" w:color="D9D5C8" w:sz="4"/>
+              <w:right w:val="single" w:color="D9D5C8" w:sz="4"/>
+            </w:tcBorders>
+            <w:tcMar>
+              <w:top w:type="dxa" w:w="60"/>
+              <w:left w:type="dxa" w:w="110"/>
+              <w:bottom w:type="dxa" w:w="60"/>
+              <w:right w:type="dxa" w:w="110"/>
+            </w:tcMar>
+          </w:tcPr>
+          <w:p>
+            <w:pPr>
+              <w:spacing w:after="0"/>
+            </w:pPr>
+            <w:r>
+              <w:rPr>
+                <w:rFonts w:ascii="Calibri" w:cs="Calibri" w:eastAsia="Calibri" w:hAnsi="Calibri"/>
+                <w:b w:val="false"/>
+                <w:bCs w:val="false"/>
+                <w:i w:val="false"/>
+                <w:iCs w:val="false"/>
+                <w:color w:val="1A1A1A"/>
+                <w:sz w:val="20"/>
+                <w:szCs w:val="20"/>
+              </w:rPr>
+              <w:t xml:space="preserve">2 accurate</w:t>
+            </w:r>
+          </w:p>
+        </w:tc>
+        <w:tc>
+          <w:tcPr>
+            <w:tcW w:type="dxa" w:w="1800"/>
+            <w:tcBorders>
+              <w:top w:val="single" w:color="D9D5C8" w:sz="4"/>
+              <w:left w:val="single" w:color="D9D5C8" w:sz="4"/>
+              <w:bottom w:val="single" w:color="D9D5C8" w:sz="4"/>
+              <w:right w:val="single" w:color="D9D5C8" w:sz="4"/>
+            </w:tcBorders>
+            <w:tcMar>
+              <w:top w:type="dxa" w:w="60"/>
+              <w:left w:type="dxa" w:w="110"/>
+              <w:bottom w:type="dxa" w:w="60"/>
+              <w:right w:type="dxa" w:w="110"/>
+            </w:tcMar>
+          </w:tcPr>
+          <w:p>
+            <w:pPr>
+              <w:spacing w:after="0"/>
+            </w:pPr>
+            <w:r>
+              <w:rPr>
+                <w:rFonts w:ascii="Calibri" w:cs="Calibri" w:eastAsia="Calibri" w:hAnsi="Calibri"/>
+                <w:b w:val="false"/>
+                <w:bCs w:val="false"/>
+                <w:i w:val="false"/>
+                <w:iCs w:val="false"/>
+                <w:color w:val="1A1A1A"/>
+                <w:sz w:val="20"/>
+                <w:szCs w:val="20"/>
+              </w:rPr>
+              <w:t xml:space="preserve">1 accurate</w:t>
+            </w:r>
+          </w:p>
+        </w:tc>
+        <w:tc>
+          <w:tcPr>
+            <w:tcW w:type="dxa" w:w="2200"/>
+            <w:tcBorders>
+              <w:top w:val="single" w:color="D9D5C8" w:sz="4"/>
+              <w:left w:val="single" w:color="D9D5C8" w:sz="4"/>
+              <w:bottom w:val="single" w:color="D9D5C8" w:sz="4"/>
+              <w:right w:val="single" w:color="D9D5C8" w:sz="4"/>
+            </w:tcBorders>
+            <w:tcMar>
+              <w:top w:type="dxa" w:w="60"/>
+              <w:left w:type="dxa" w:w="110"/>
+              <w:bottom w:type="dxa" w:w="60"/>
+              <w:right w:type="dxa" w:w="110"/>
+            </w:tcMar>
+          </w:tcPr>
+          <w:p>
+            <w:pPr>
+              <w:spacing w:after="0"/>
+            </w:pPr>
+            <w:r>
+              <w:rPr>
+                <w:rFonts w:ascii="Calibri" w:cs="Calibri" w:eastAsia="Calibri" w:hAnsi="Calibri"/>
+                <w:b w:val="false"/>
+                <w:bCs w:val="false"/>
+                <w:i w:val="false"/>
+                <w:iCs w:val="false"/>
+                <w:color w:val="1A1A1A"/>
+                <w:sz w:val="20"/>
+                <w:szCs w:val="20"/>
+              </w:rPr>
+              <w:t xml:space="preserve">Missing / inaccurate</w:t>
+            </w:r>
+          </w:p>
+        </w:tc>
+      </w:tr>
+      <w:tr>
+        <w:tc>
+          <w:tcPr>
+            <w:tcW w:type="dxa" w:w="1748"/>
+            <w:tcBorders>
+              <w:top w:val="single" w:color="D9D5C8" w:sz="4"/>
+              <w:left w:val="single" w:color="D9D5C8" w:sz="4"/>
+              <w:bottom w:val="single" w:color="D9D5C8" w:sz="4"/>
+              <w:right w:val="single" w:color="D9D5C8" w:sz="4"/>
+            </w:tcBorders>
+            <w:tcMar>
+              <w:top w:type="dxa" w:w="60"/>
+              <w:left w:type="dxa" w:w="110"/>
+              <w:bottom w:type="dxa" w:w="60"/>
+              <w:right w:type="dxa" w:w="110"/>
+            </w:tcMar>
+          </w:tcPr>
+          <w:p>
+            <w:pPr>
+              <w:spacing w:after="0"/>
+            </w:pPr>
+            <w:r>
+              <w:rPr>
+                <w:rFonts w:ascii="Calibri" w:cs="Calibri" w:eastAsia="Calibri" w:hAnsi="Calibri"/>
+                <w:b w:val="false"/>
+                <w:bCs w:val="false"/>
+                <w:i w:val="false"/>
+                <w:iCs w:val="false"/>
+                <w:color w:val="1A1A1A"/>
+                <w:sz w:val="20"/>
+                <w:szCs w:val="20"/>
+              </w:rPr>
+              <w:t xml:space="preserve">Reasoning</w:t>
+            </w:r>
+          </w:p>
+        </w:tc>
+        <w:tc>
+          <w:tcPr>
+            <w:tcW w:type="dxa" w:w="2100"/>
+            <w:tcBorders>
+              <w:top w:val="single" w:color="D9D5C8" w:sz="4"/>
+              <w:left w:val="single" w:color="D9D5C8" w:sz="4"/>
+              <w:bottom w:val="single" w:color="D9D5C8" w:sz="4"/>
+              <w:right w:val="single" w:color="D9D5C8" w:sz="4"/>
+            </w:tcBorders>
+            <w:tcMar>
+              <w:top w:type="dxa" w:w="60"/>
+              <w:left w:type="dxa" w:w="110"/>
+              <w:bottom w:type="dxa" w:w="60"/>
+              <w:right w:type="dxa" w:w="110"/>
+            </w:tcMar>
+          </w:tcPr>
+          <w:p>
+            <w:pPr>
+              <w:spacing w:after="0"/>
+            </w:pPr>
+            <w:r>
+              <w:rPr>
+                <w:rFonts w:ascii="Calibri" w:cs="Calibri" w:eastAsia="Calibri" w:hAnsi="Calibri"/>
+                <w:b w:val="false"/>
+                <w:bCs w:val="false"/>
+                <w:i w:val="false"/>
+                <w:iCs w:val="false"/>
+                <w:color w:val="1A1A1A"/>
+                <w:sz w:val="20"/>
+                <w:szCs w:val="20"/>
+              </w:rPr>
+              <w:t xml:space="preserve">Explains HOW the evidence proves the claim</w:t>
+            </w:r>
+          </w:p>
+        </w:tc>
+        <w:tc>
+          <w:tcPr>
+            <w:tcW w:type="dxa" w:w="1800"/>
+            <w:tcBorders>
+              <w:top w:val="single" w:color="D9D5C8" w:sz="4"/>
+              <w:left w:val="single" w:color="D9D5C8" w:sz="4"/>
+              <w:bottom w:val="single" w:color="D9D5C8" w:sz="4"/>
+              <w:right w:val="single" w:color="D9D5C8" w:sz="4"/>
+            </w:tcBorders>
+            <w:tcMar>
+              <w:top w:type="dxa" w:w="60"/>
+              <w:left w:type="dxa" w:w="110"/>
+              <w:bottom w:type="dxa" w:w="60"/>
+              <w:right w:type="dxa" w:w="110"/>
+            </w:tcMar>
+          </w:tcPr>
+          <w:p>
+            <w:pPr>
+              <w:spacing w:after="0"/>
+            </w:pPr>
+            <w:r>
+              <w:rPr>
+                <w:rFonts w:ascii="Calibri" w:cs="Calibri" w:eastAsia="Calibri" w:hAnsi="Calibri"/>
+                <w:b w:val="false"/>
+                <w:bCs w:val="false"/>
+                <w:i w:val="false"/>
+                <w:iCs w:val="false"/>
+                <w:color w:val="1A1A1A"/>
+                <w:sz w:val="20"/>
+                <w:szCs w:val="20"/>
+              </w:rPr>
+              <w:t xml:space="preserve">Explains the link</w:t>
+            </w:r>
+          </w:p>
+        </w:tc>
+        <w:tc>
+          <w:tcPr>
+            <w:tcW w:type="dxa" w:w="1800"/>
+            <w:tcBorders>
+              <w:top w:val="single" w:color="D9D5C8" w:sz="4"/>
+              <w:left w:val="single" w:color="D9D5C8" w:sz="4"/>
+              <w:bottom w:val="single" w:color="D9D5C8" w:sz="4"/>
+              <w:right w:val="single" w:color="D9D5C8" w:sz="4"/>
+            </w:tcBorders>
+            <w:tcMar>
+              <w:top w:type="dxa" w:w="60"/>
+              <w:left w:type="dxa" w:w="110"/>
+              <w:bottom w:type="dxa" w:w="60"/>
+              <w:right w:type="dxa" w:w="110"/>
+            </w:tcMar>
+          </w:tcPr>
+          <w:p>
+            <w:pPr>
+              <w:spacing w:after="0"/>
+            </w:pPr>
+            <w:r>
+              <w:rPr>
+                <w:rFonts w:ascii="Calibri" w:cs="Calibri" w:eastAsia="Calibri" w:hAnsi="Calibri"/>
+                <w:b w:val="false"/>
+                <w:bCs w:val="false"/>
+                <w:i w:val="false"/>
+                <w:iCs w:val="false"/>
+                <w:color w:val="1A1A1A"/>
+                <w:sz w:val="20"/>
+                <w:szCs w:val="20"/>
+              </w:rPr>
+              <w:t xml:space="preserve">Partial link</w:t>
+            </w:r>
+          </w:p>
+        </w:tc>
+        <w:tc>
+          <w:tcPr>
+            <w:tcW w:type="dxa" w:w="2200"/>
+            <w:tcBorders>
+              <w:top w:val="single" w:color="D9D5C8" w:sz="4"/>
+              <w:left w:val="single" w:color="D9D5C8" w:sz="4"/>
+              <w:bottom w:val="single" w:color="D9D5C8" w:sz="4"/>
+              <w:right w:val="single" w:color="D9D5C8" w:sz="4"/>
+            </w:tcBorders>
+            <w:tcMar>
+              <w:top w:type="dxa" w:w="60"/>
+              <w:left w:type="dxa" w:w="110"/>
+              <w:bottom w:type="dxa" w:w="60"/>
+              <w:right w:type="dxa" w:w="110"/>
+            </w:tcMar>
+          </w:tcPr>
+          <w:p>
+            <w:pPr>
+              <w:spacing w:after="0"/>
+            </w:pPr>
+            <w:r>
+              <w:rPr>
+                <w:rFonts w:ascii="Calibri" w:cs="Calibri" w:eastAsia="Calibri" w:hAnsi="Calibri"/>
+                <w:b w:val="false"/>
+                <w:bCs w:val="false"/>
+                <w:i w:val="false"/>
+                <w:iCs w:val="false"/>
+                <w:color w:val="1A1A1A"/>
+                <w:sz w:val="20"/>
+                <w:szCs w:val="20"/>
+              </w:rPr>
+              <w:t xml:space="preserve">No reasoning</w:t>
+            </w:r>
+          </w:p>
+        </w:tc>
+      </w:tr>
+    </w:tbl>
+    <w:tbl>
+      <w:tblPr>
+        <w:tblW w:type="dxa" w:w="9648"/>
+        <w:tblBorders>
+          <w:top w:val="single" w:color="auto" w:sz="4"/>
+          <w:left w:val="single" w:color="auto" w:sz="4"/>
+          <w:bottom w:val="single" w:color="auto" w:sz="4"/>
+          <w:right w:val="single" w:color="auto" w:sz="4"/>
+          <w:insideH w:val="single" w:color="auto" w:sz="4"/>
+          <w:insideV w:val="single" w:color="auto" w:sz="4"/>
+        </w:tblBorders>
+      </w:tblPr>
+      <w:tblGrid>
+        <w:gridCol w:w="9648"/>
+      </w:tblGrid>
+      <w:tr>
+        <w:tc>
+          <w:tcPr>
+            <w:tcW w:type="dxa" w:w="9648"/>
+            <w:tcBorders>
+              <w:top w:val="single" w:color="D9D5C8" w:sz="4"/>
+              <w:left w:val="single" w:color="D9D5C8" w:sz="4"/>
+              <w:bottom w:val="single" w:color="D9D5C8" w:sz="4"/>
+              <w:right w:val="single" w:color="D9D5C8" w:sz="4"/>
+            </w:tcBorders>
+            <w:shd w:fill="F7F5EF" w:color="auto" w:val="clear"/>
+            <w:tcMar>
+              <w:top w:type="dxa" w:w="60"/>
+              <w:left w:type="dxa" w:w="110"/>
+              <w:bottom w:type="dxa" w:w="60"/>
+              <w:right w:type="dxa" w:w="110"/>
+            </w:tcMar>
+          </w:tcPr>
+          <w:p>
+            <w:pPr>
+              <w:spacing w:after="60"/>
+            </w:pPr>
+            <w:r>
+              <w:rPr>
+                <w:rFonts w:ascii="Calibri" w:cs="Calibri" w:eastAsia="Calibri" w:hAnsi="Calibri"/>
+                <w:b/>
+                <w:bCs/>
+                <w:i w:val="false"/>
+                <w:iCs w:val="false"/>
+                <w:color w:val="1B2A4A"/>
+                <w:sz w:val="21"/>
+                <w:szCs w:val="21"/>
+              </w:rPr>
+              <w:t xml:space="preserve">THE WEB-APP CHECK — use the self-vs-app gap as a formative signal</w:t>
+            </w:r>
+          </w:p>
+          <w:p>
+            <w:pPr>
+              <w:spacing w:after="40"/>
+            </w:pPr>
+            <w:r>
+              <w:rPr>
+                <w:rFonts w:ascii="Calibri" w:cs="Calibri" w:eastAsia="Calibri" w:hAnsi="Calibri"/>
+                <w:b w:val="false"/>
+                <w:bCs w:val="false"/>
+                <w:i w:val="false"/>
+                <w:iCs w:val="false"/>
+                <w:color w:val="1A1A1A"/>
+                <w:sz w:val="22"/>
+                <w:szCs w:val="22"/>
+              </w:rPr>
+              <w:t xml:space="preserve">After self-scoring on paper, the student types the response into the History Hack app and gets instant, rubric-based feedback scored on this same 4-level grid.</w:t>
+            </w:r>
+          </w:p>
+          <w:p>
+            <w:pPr>
+              <w:spacing w:after="40"/>
+            </w:pPr>
+            <w:r>
+              <w:rPr>
+                <w:rFonts w:ascii="Calibri" w:cs="Calibri" w:eastAsia="Calibri" w:hAnsi="Calibri"/>
+                <w:b w:val="false"/>
+                <w:bCs w:val="false"/>
+                <w:i w:val="false"/>
+                <w:iCs w:val="false"/>
+                <w:color w:val="1A1A1A"/>
+                <w:sz w:val="22"/>
+                <w:szCs w:val="22"/>
+              </w:rPr>
+              <w:t xml:space="preserve">Coaching move: have students compare the app’s score to their own. A large over-rating gap (“I marked 4, the app said 2”) flags a student who can’t yet see the rubric criteria in their own writing — reteach the criterion, not just the content. Close agreement means the student can self-assess accurately; push them to the Extension.</w:t>
+            </w:r>
+          </w:p>
+        </w:tc>
+      </w:tr>
+    </w:tbl>
+    <w:p>
+      <w:pPr>
+        <w:pStyle w:val="Heading2"/>
+        <w:keepNext/>
+        <w:spacing w:after="90" w:before="150"/>
+      </w:pPr>
+      <w:r>
+        <w:rPr>
+          <w:rFonts w:ascii="Calibri" w:cs="Calibri" w:eastAsia="Calibri" w:hAnsi="Calibri"/>
+          <w:b/>
+          <w:bCs/>
+          <w:i w:val="false"/>
+          <w:iCs w:val="false"/>
+          <w:color w:val="1B2A4A"/>
+          <w:sz w:val="28"/>
+          <w:szCs w:val="28"/>
+        </w:rPr>
+        <w:t xml:space="preserve">15b. Your 6-point scale (gradebook convention) + crosswalk</w:t>
+      </w:r>
+    </w:p>
+    <w:p>
+      <w:pPr>
+        <w:spacing w:after="100"/>
+      </w:pPr>
+      <w:r>
+        <w:rPr>
+          <w:rFonts w:ascii="Calibri" w:cs="Calibri" w:eastAsia="Calibri" w:hAnsi="Calibri"/>
+          <w:b w:val="false"/>
+          <w:bCs w:val="false"/>
+          <w:i w:val="false"/>
+          <w:iCs w:val="false"/>
+          <w:color w:val="1A1A1A"/>
+          <w:sz w:val="22"/>
+          <w:szCs w:val="22"/>
+        </w:rPr>
+        <w:t xml:space="preserve">Score holistically on the 6-point scale below (aligns with the DBQ/CER rubric bank). Use the crosswalk to reconcile a student’s /12 self-score with your 6-point mark.</w:t>
       </w:r>
     </w:p>
     <w:tbl>
@@ -21309,6 +22211,532 @@
         </w:tc>
       </w:tr>
     </w:tbl>
+    <w:tbl>
+      <w:tblPr>
+        <w:tblW w:type="dxa" w:w="9648"/>
+        <w:tblBorders>
+          <w:top w:val="single" w:color="auto" w:sz="4"/>
+          <w:left w:val="single" w:color="auto" w:sz="4"/>
+          <w:bottom w:val="single" w:color="auto" w:sz="4"/>
+          <w:right w:val="single" w:color="auto" w:sz="4"/>
+          <w:insideH w:val="single" w:color="auto" w:sz="4"/>
+          <w:insideV w:val="single" w:color="auto" w:sz="4"/>
+        </w:tblBorders>
+      </w:tblPr>
+      <w:tblGrid>
+        <w:gridCol w:w="4824"/>
+        <w:gridCol w:w="4824"/>
+      </w:tblGrid>
+      <w:tr>
+        <w:trPr>
+          <w:tblHeader/>
+        </w:trPr>
+        <w:tc>
+          <w:tcPr>
+            <w:tcW w:type="dxa" w:w="4824"/>
+            <w:tcBorders>
+              <w:top w:val="single" w:color="D9D5C8" w:sz="4"/>
+              <w:left w:val="single" w:color="D9D5C8" w:sz="4"/>
+              <w:bottom w:val="single" w:color="D9D5C8" w:sz="4"/>
+              <w:right w:val="single" w:color="D9D5C8" w:sz="4"/>
+            </w:tcBorders>
+            <w:shd w:fill="1B2A4A" w:color="auto" w:val="clear"/>
+            <w:tcMar>
+              <w:top w:type="dxa" w:w="60"/>
+              <w:left w:type="dxa" w:w="110"/>
+              <w:bottom w:type="dxa" w:w="60"/>
+              <w:right w:type="dxa" w:w="110"/>
+            </w:tcMar>
+          </w:tcPr>
+          <w:p>
+            <w:pPr>
+              <w:spacing w:after="0"/>
+            </w:pPr>
+            <w:r>
+              <w:rPr>
+                <w:rFonts w:ascii="Calibri" w:cs="Calibri" w:eastAsia="Calibri" w:hAnsi="Calibri"/>
+                <w:b/>
+                <w:bCs/>
+                <w:i w:val="false"/>
+                <w:iCs w:val="false"/>
+                <w:color w:val="FFFFFF"/>
+                <w:sz w:val="19"/>
+                <w:szCs w:val="19"/>
+              </w:rPr>
+              <w:t xml:space="preserve">Student self-score (total / 12)</w:t>
+            </w:r>
+          </w:p>
+        </w:tc>
+        <w:tc>
+          <w:tcPr>
+            <w:tcW w:type="dxa" w:w="4824"/>
+            <w:tcBorders>
+              <w:top w:val="single" w:color="D9D5C8" w:sz="4"/>
+              <w:left w:val="single" w:color="D9D5C8" w:sz="4"/>
+              <w:bottom w:val="single" w:color="D9D5C8" w:sz="4"/>
+              <w:right w:val="single" w:color="D9D5C8" w:sz="4"/>
+            </w:tcBorders>
+            <w:shd w:fill="1B2A4A" w:color="auto" w:val="clear"/>
+            <w:tcMar>
+              <w:top w:type="dxa" w:w="60"/>
+              <w:left w:type="dxa" w:w="110"/>
+              <w:bottom w:type="dxa" w:w="60"/>
+              <w:right w:type="dxa" w:w="110"/>
+            </w:tcMar>
+          </w:tcPr>
+          <w:p>
+            <w:pPr>
+              <w:spacing w:after="0"/>
+            </w:pPr>
+            <w:r>
+              <w:rPr>
+                <w:rFonts w:ascii="Calibri" w:cs="Calibri" w:eastAsia="Calibri" w:hAnsi="Calibri"/>
+                <w:b/>
+                <w:bCs/>
+                <w:i w:val="false"/>
+                <w:iCs w:val="false"/>
+                <w:color w:val="FFFFFF"/>
+                <w:sz w:val="19"/>
+                <w:szCs w:val="19"/>
+              </w:rPr>
+              <w:t xml:space="preserve">≈ Your 6-point band</w:t>
+            </w:r>
+          </w:p>
+        </w:tc>
+      </w:tr>
+      <w:tr>
+        <w:tc>
+          <w:tcPr>
+            <w:tcW w:type="dxa" w:w="4824"/>
+            <w:tcBorders>
+              <w:top w:val="single" w:color="D9D5C8" w:sz="4"/>
+              <w:left w:val="single" w:color="D9D5C8" w:sz="4"/>
+              <w:bottom w:val="single" w:color="D9D5C8" w:sz="4"/>
+              <w:right w:val="single" w:color="D9D5C8" w:sz="4"/>
+            </w:tcBorders>
+            <w:tcMar>
+              <w:top w:type="dxa" w:w="60"/>
+              <w:left w:type="dxa" w:w="110"/>
+              <w:bottom w:type="dxa" w:w="60"/>
+              <w:right w:type="dxa" w:w="110"/>
+            </w:tcMar>
+          </w:tcPr>
+          <w:p>
+            <w:pPr>
+              <w:spacing w:after="0"/>
+            </w:pPr>
+            <w:r>
+              <w:rPr>
+                <w:rFonts w:ascii="Calibri" w:cs="Calibri" w:eastAsia="Calibri" w:hAnsi="Calibri"/>
+                <w:b w:val="false"/>
+                <w:bCs w:val="false"/>
+                <w:i w:val="false"/>
+                <w:iCs w:val="false"/>
+                <w:color w:val="1A1A1A"/>
+                <w:sz w:val="20"/>
+                <w:szCs w:val="20"/>
+              </w:rPr>
+              <w:t xml:space="preserve">12</w:t>
+            </w:r>
+          </w:p>
+        </w:tc>
+        <w:tc>
+          <w:tcPr>
+            <w:tcW w:type="dxa" w:w="4824"/>
+            <w:tcBorders>
+              <w:top w:val="single" w:color="D9D5C8" w:sz="4"/>
+              <w:left w:val="single" w:color="D9D5C8" w:sz="4"/>
+              <w:bottom w:val="single" w:color="D9D5C8" w:sz="4"/>
+              <w:right w:val="single" w:color="D9D5C8" w:sz="4"/>
+            </w:tcBorders>
+            <w:tcMar>
+              <w:top w:type="dxa" w:w="60"/>
+              <w:left w:type="dxa" w:w="110"/>
+              <w:bottom w:type="dxa" w:w="60"/>
+              <w:right w:type="dxa" w:w="110"/>
+            </w:tcMar>
+          </w:tcPr>
+          <w:p>
+            <w:pPr>
+              <w:spacing w:after="0"/>
+            </w:pPr>
+            <w:r>
+              <w:rPr>
+                <w:rFonts w:ascii="Calibri" w:cs="Calibri" w:eastAsia="Calibri" w:hAnsi="Calibri"/>
+                <w:b w:val="false"/>
+                <w:bCs w:val="false"/>
+                <w:i w:val="false"/>
+                <w:iCs w:val="false"/>
+                <w:color w:val="1A1A1A"/>
+                <w:sz w:val="20"/>
+                <w:szCs w:val="20"/>
+              </w:rPr>
+              <w:t xml:space="preserve">6 · Exemplary</w:t>
+            </w:r>
+          </w:p>
+        </w:tc>
+      </w:tr>
+      <w:tr>
+        <w:tc>
+          <w:tcPr>
+            <w:tcW w:type="dxa" w:w="4824"/>
+            <w:tcBorders>
+              <w:top w:val="single" w:color="D9D5C8" w:sz="4"/>
+              <w:left w:val="single" w:color="D9D5C8" w:sz="4"/>
+              <w:bottom w:val="single" w:color="D9D5C8" w:sz="4"/>
+              <w:right w:val="single" w:color="D9D5C8" w:sz="4"/>
+            </w:tcBorders>
+            <w:tcMar>
+              <w:top w:type="dxa" w:w="60"/>
+              <w:left w:type="dxa" w:w="110"/>
+              <w:bottom w:type="dxa" w:w="60"/>
+              <w:right w:type="dxa" w:w="110"/>
+            </w:tcMar>
+          </w:tcPr>
+          <w:p>
+            <w:pPr>
+              <w:spacing w:after="0"/>
+            </w:pPr>
+            <w:r>
+              <w:rPr>
+                <w:rFonts w:ascii="Calibri" w:cs="Calibri" w:eastAsia="Calibri" w:hAnsi="Calibri"/>
+                <w:b w:val="false"/>
+                <w:bCs w:val="false"/>
+                <w:i w:val="false"/>
+                <w:iCs w:val="false"/>
+                <w:color w:val="1A1A1A"/>
+                <w:sz w:val="20"/>
+                <w:szCs w:val="20"/>
+              </w:rPr>
+              <w:t xml:space="preserve">10–11</w:t>
+            </w:r>
+          </w:p>
+        </w:tc>
+        <w:tc>
+          <w:tcPr>
+            <w:tcW w:type="dxa" w:w="4824"/>
+            <w:tcBorders>
+              <w:top w:val="single" w:color="D9D5C8" w:sz="4"/>
+              <w:left w:val="single" w:color="D9D5C8" w:sz="4"/>
+              <w:bottom w:val="single" w:color="D9D5C8" w:sz="4"/>
+              <w:right w:val="single" w:color="D9D5C8" w:sz="4"/>
+            </w:tcBorders>
+            <w:tcMar>
+              <w:top w:type="dxa" w:w="60"/>
+              <w:left w:type="dxa" w:w="110"/>
+              <w:bottom w:type="dxa" w:w="60"/>
+              <w:right w:type="dxa" w:w="110"/>
+            </w:tcMar>
+          </w:tcPr>
+          <w:p>
+            <w:pPr>
+              <w:spacing w:after="0"/>
+            </w:pPr>
+            <w:r>
+              <w:rPr>
+                <w:rFonts w:ascii="Calibri" w:cs="Calibri" w:eastAsia="Calibri" w:hAnsi="Calibri"/>
+                <w:b w:val="false"/>
+                <w:bCs w:val="false"/>
+                <w:i w:val="false"/>
+                <w:iCs w:val="false"/>
+                <w:color w:val="1A1A1A"/>
+                <w:sz w:val="20"/>
+                <w:szCs w:val="20"/>
+              </w:rPr>
+              <w:t xml:space="preserve">5 · Advanced</w:t>
+            </w:r>
+          </w:p>
+        </w:tc>
+      </w:tr>
+      <w:tr>
+        <w:tc>
+          <w:tcPr>
+            <w:tcW w:type="dxa" w:w="4824"/>
+            <w:tcBorders>
+              <w:top w:val="single" w:color="D9D5C8" w:sz="4"/>
+              <w:left w:val="single" w:color="D9D5C8" w:sz="4"/>
+              <w:bottom w:val="single" w:color="D9D5C8" w:sz="4"/>
+              <w:right w:val="single" w:color="D9D5C8" w:sz="4"/>
+            </w:tcBorders>
+            <w:tcMar>
+              <w:top w:type="dxa" w:w="60"/>
+              <w:left w:type="dxa" w:w="110"/>
+              <w:bottom w:type="dxa" w:w="60"/>
+              <w:right w:type="dxa" w:w="110"/>
+            </w:tcMar>
+          </w:tcPr>
+          <w:p>
+            <w:pPr>
+              <w:spacing w:after="0"/>
+            </w:pPr>
+            <w:r>
+              <w:rPr>
+                <w:rFonts w:ascii="Calibri" w:cs="Calibri" w:eastAsia="Calibri" w:hAnsi="Calibri"/>
+                <w:b w:val="false"/>
+                <w:bCs w:val="false"/>
+                <w:i w:val="false"/>
+                <w:iCs w:val="false"/>
+                <w:color w:val="1A1A1A"/>
+                <w:sz w:val="20"/>
+                <w:szCs w:val="20"/>
+              </w:rPr>
+              <w:t xml:space="preserve">8–9</w:t>
+            </w:r>
+          </w:p>
+        </w:tc>
+        <w:tc>
+          <w:tcPr>
+            <w:tcW w:type="dxa" w:w="4824"/>
+            <w:tcBorders>
+              <w:top w:val="single" w:color="D9D5C8" w:sz="4"/>
+              <w:left w:val="single" w:color="D9D5C8" w:sz="4"/>
+              <w:bottom w:val="single" w:color="D9D5C8" w:sz="4"/>
+              <w:right w:val="single" w:color="D9D5C8" w:sz="4"/>
+            </w:tcBorders>
+            <w:tcMar>
+              <w:top w:type="dxa" w:w="60"/>
+              <w:left w:type="dxa" w:w="110"/>
+              <w:bottom w:type="dxa" w:w="60"/>
+              <w:right w:type="dxa" w:w="110"/>
+            </w:tcMar>
+          </w:tcPr>
+          <w:p>
+            <w:pPr>
+              <w:spacing w:after="0"/>
+            </w:pPr>
+            <w:r>
+              <w:rPr>
+                <w:rFonts w:ascii="Calibri" w:cs="Calibri" w:eastAsia="Calibri" w:hAnsi="Calibri"/>
+                <w:b w:val="false"/>
+                <w:bCs w:val="false"/>
+                <w:i w:val="false"/>
+                <w:iCs w:val="false"/>
+                <w:color w:val="1A1A1A"/>
+                <w:sz w:val="20"/>
+                <w:szCs w:val="20"/>
+              </w:rPr>
+              <w:t xml:space="preserve">4 · Proficient</w:t>
+            </w:r>
+          </w:p>
+        </w:tc>
+      </w:tr>
+      <w:tr>
+        <w:tc>
+          <w:tcPr>
+            <w:tcW w:type="dxa" w:w="4824"/>
+            <w:tcBorders>
+              <w:top w:val="single" w:color="D9D5C8" w:sz="4"/>
+              <w:left w:val="single" w:color="D9D5C8" w:sz="4"/>
+              <w:bottom w:val="single" w:color="D9D5C8" w:sz="4"/>
+              <w:right w:val="single" w:color="D9D5C8" w:sz="4"/>
+            </w:tcBorders>
+            <w:tcMar>
+              <w:top w:type="dxa" w:w="60"/>
+              <w:left w:type="dxa" w:w="110"/>
+              <w:bottom w:type="dxa" w:w="60"/>
+              <w:right w:type="dxa" w:w="110"/>
+            </w:tcMar>
+          </w:tcPr>
+          <w:p>
+            <w:pPr>
+              <w:spacing w:after="0"/>
+            </w:pPr>
+            <w:r>
+              <w:rPr>
+                <w:rFonts w:ascii="Calibri" w:cs="Calibri" w:eastAsia="Calibri" w:hAnsi="Calibri"/>
+                <w:b w:val="false"/>
+                <w:bCs w:val="false"/>
+                <w:i w:val="false"/>
+                <w:iCs w:val="false"/>
+                <w:color w:val="1A1A1A"/>
+                <w:sz w:val="20"/>
+                <w:szCs w:val="20"/>
+              </w:rPr>
+              <w:t xml:space="preserve">6–7</w:t>
+            </w:r>
+          </w:p>
+        </w:tc>
+        <w:tc>
+          <w:tcPr>
+            <w:tcW w:type="dxa" w:w="4824"/>
+            <w:tcBorders>
+              <w:top w:val="single" w:color="D9D5C8" w:sz="4"/>
+              <w:left w:val="single" w:color="D9D5C8" w:sz="4"/>
+              <w:bottom w:val="single" w:color="D9D5C8" w:sz="4"/>
+              <w:right w:val="single" w:color="D9D5C8" w:sz="4"/>
+            </w:tcBorders>
+            <w:tcMar>
+              <w:top w:type="dxa" w:w="60"/>
+              <w:left w:type="dxa" w:w="110"/>
+              <w:bottom w:type="dxa" w:w="60"/>
+              <w:right w:type="dxa" w:w="110"/>
+            </w:tcMar>
+          </w:tcPr>
+          <w:p>
+            <w:pPr>
+              <w:spacing w:after="0"/>
+            </w:pPr>
+            <w:r>
+              <w:rPr>
+                <w:rFonts w:ascii="Calibri" w:cs="Calibri" w:eastAsia="Calibri" w:hAnsi="Calibri"/>
+                <w:b w:val="false"/>
+                <w:bCs w:val="false"/>
+                <w:i w:val="false"/>
+                <w:iCs w:val="false"/>
+                <w:color w:val="1A1A1A"/>
+                <w:sz w:val="20"/>
+                <w:szCs w:val="20"/>
+              </w:rPr>
+              <w:t xml:space="preserve">3 · Adequate</w:t>
+            </w:r>
+          </w:p>
+        </w:tc>
+      </w:tr>
+      <w:tr>
+        <w:tc>
+          <w:tcPr>
+            <w:tcW w:type="dxa" w:w="4824"/>
+            <w:tcBorders>
+              <w:top w:val="single" w:color="D9D5C8" w:sz="4"/>
+              <w:left w:val="single" w:color="D9D5C8" w:sz="4"/>
+              <w:bottom w:val="single" w:color="D9D5C8" w:sz="4"/>
+              <w:right w:val="single" w:color="D9D5C8" w:sz="4"/>
+            </w:tcBorders>
+            <w:tcMar>
+              <w:top w:type="dxa" w:w="60"/>
+              <w:left w:type="dxa" w:w="110"/>
+              <w:bottom w:type="dxa" w:w="60"/>
+              <w:right w:type="dxa" w:w="110"/>
+            </w:tcMar>
+          </w:tcPr>
+          <w:p>
+            <w:pPr>
+              <w:spacing w:after="0"/>
+            </w:pPr>
+            <w:r>
+              <w:rPr>
+                <w:rFonts w:ascii="Calibri" w:cs="Calibri" w:eastAsia="Calibri" w:hAnsi="Calibri"/>
+                <w:b w:val="false"/>
+                <w:bCs w:val="false"/>
+                <w:i w:val="false"/>
+                <w:iCs w:val="false"/>
+                <w:color w:val="1A1A1A"/>
+                <w:sz w:val="20"/>
+                <w:szCs w:val="20"/>
+              </w:rPr>
+              <w:t xml:space="preserve">4–5</w:t>
+            </w:r>
+          </w:p>
+        </w:tc>
+        <w:tc>
+          <w:tcPr>
+            <w:tcW w:type="dxa" w:w="4824"/>
+            <w:tcBorders>
+              <w:top w:val="single" w:color="D9D5C8" w:sz="4"/>
+              <w:left w:val="single" w:color="D9D5C8" w:sz="4"/>
+              <w:bottom w:val="single" w:color="D9D5C8" w:sz="4"/>
+              <w:right w:val="single" w:color="D9D5C8" w:sz="4"/>
+            </w:tcBorders>
+            <w:tcMar>
+              <w:top w:type="dxa" w:w="60"/>
+              <w:left w:type="dxa" w:w="110"/>
+              <w:bottom w:type="dxa" w:w="60"/>
+              <w:right w:type="dxa" w:w="110"/>
+            </w:tcMar>
+          </w:tcPr>
+          <w:p>
+            <w:pPr>
+              <w:spacing w:after="0"/>
+            </w:pPr>
+            <w:r>
+              <w:rPr>
+                <w:rFonts w:ascii="Calibri" w:cs="Calibri" w:eastAsia="Calibri" w:hAnsi="Calibri"/>
+                <w:b w:val="false"/>
+                <w:bCs w:val="false"/>
+                <w:i w:val="false"/>
+                <w:iCs w:val="false"/>
+                <w:color w:val="1A1A1A"/>
+                <w:sz w:val="20"/>
+                <w:szCs w:val="20"/>
+              </w:rPr>
+              <w:t xml:space="preserve">2 · Developing</w:t>
+            </w:r>
+          </w:p>
+        </w:tc>
+      </w:tr>
+      <w:tr>
+        <w:tc>
+          <w:tcPr>
+            <w:tcW w:type="dxa" w:w="4824"/>
+            <w:tcBorders>
+              <w:top w:val="single" w:color="D9D5C8" w:sz="4"/>
+              <w:left w:val="single" w:color="D9D5C8" w:sz="4"/>
+              <w:bottom w:val="single" w:color="D9D5C8" w:sz="4"/>
+              <w:right w:val="single" w:color="D9D5C8" w:sz="4"/>
+            </w:tcBorders>
+            <w:tcMar>
+              <w:top w:type="dxa" w:w="60"/>
+              <w:left w:type="dxa" w:w="110"/>
+              <w:bottom w:type="dxa" w:w="60"/>
+              <w:right w:type="dxa" w:w="110"/>
+            </w:tcMar>
+          </w:tcPr>
+          <w:p>
+            <w:pPr>
+              <w:spacing w:after="0"/>
+            </w:pPr>
+            <w:r>
+              <w:rPr>
+                <w:rFonts w:ascii="Calibri" w:cs="Calibri" w:eastAsia="Calibri" w:hAnsi="Calibri"/>
+                <w:b w:val="false"/>
+                <w:bCs w:val="false"/>
+                <w:i w:val="false"/>
+                <w:iCs w:val="false"/>
+                <w:color w:val="1A1A1A"/>
+                <w:sz w:val="20"/>
+                <w:szCs w:val="20"/>
+              </w:rPr>
+              <w:t xml:space="preserve">3</w:t>
+            </w:r>
+          </w:p>
+        </w:tc>
+        <w:tc>
+          <w:tcPr>
+            <w:tcW w:type="dxa" w:w="4824"/>
+            <w:tcBorders>
+              <w:top w:val="single" w:color="D9D5C8" w:sz="4"/>
+              <w:left w:val="single" w:color="D9D5C8" w:sz="4"/>
+              <w:bottom w:val="single" w:color="D9D5C8" w:sz="4"/>
+              <w:right w:val="single" w:color="D9D5C8" w:sz="4"/>
+            </w:tcBorders>
+            <w:tcMar>
+              <w:top w:type="dxa" w:w="60"/>
+              <w:left w:type="dxa" w:w="110"/>
+              <w:bottom w:type="dxa" w:w="60"/>
+              <w:right w:type="dxa" w:w="110"/>
+            </w:tcMar>
+          </w:tcPr>
+          <w:p>
+            <w:pPr>
+              <w:spacing w:after="0"/>
+            </w:pPr>
+            <w:r>
+              <w:rPr>
+                <w:rFonts w:ascii="Calibri" w:cs="Calibri" w:eastAsia="Calibri" w:hAnsi="Calibri"/>
+                <w:b w:val="false"/>
+                <w:bCs w:val="false"/>
+                <w:i w:val="false"/>
+                <w:iCs w:val="false"/>
+                <w:color w:val="1A1A1A"/>
+                <w:sz w:val="20"/>
+                <w:szCs w:val="20"/>
+              </w:rPr>
+              <w:t xml:space="preserve">1 · Beginning</w:t>
+            </w:r>
+          </w:p>
+        </w:tc>
+      </w:tr>
+    </w:tbl>
     <w:p>
       <w:pPr>
         <w:spacing w:after="100"/>
@@ -21324,7 +22752,7 @@
           <w:sz w:val="18"/>
           <w:szCs w:val="18"/>
         </w:rPr>
-        <w:t xml:space="preserve">Swap in your bank’s exact CER rubric text if it differs; the 6-point scale (6 Exemplary → 1 Beginning) is the course convention.</w:t>
+        <w:t xml:space="preserve">Swap in your bank’s exact CER rubric text if it differs; the student 4-level grid and the 6-point scale (6 Exemplary → 1 Beginning) are the course convention, and the web app scores on the same 4-level grid.</w:t>
       </w:r>
     </w:p>
     <w:p>
@@ -24121,8 +25549,8 @@
         <w:i w:val="false"/>
         <w:iCs w:val="false"/>
         <w:color w:val="6B7280"/>
-        <w:sz w:val="15"/>
-        <w:szCs w:val="15"/>
+        <w:sz w:val="18"/>
+        <w:szCs w:val="18"/>
       </w:rPr>
       <w:t xml:space="preserve">U.S. History Hack™ · Unit 6 Teacher Guide   © 2026 TroopToTeacher Technologies LLC   |   Page </w:t>
     </w:r>
@@ -24132,8 +25560,8 @@
         <w:b/>
         <w:bCs/>
         <w:color w:val="6B7280"/>
-        <w:sz w:val="15"/>
-        <w:szCs w:val="15"/>
+        <w:sz w:val="18"/>
+        <w:szCs w:val="18"/>
       </w:rPr>
       <w:fldChar w:fldCharType="begin"/>
       <w:instrText xml:space="preserve">PAGE</w:instrText>
@@ -24196,8 +25624,8 @@
         <w:i w:val="false"/>
         <w:iCs w:val="false"/>
         <w:color w:val="C89B3C"/>
-        <w:sz w:val="16"/>
-        <w:szCs w:val="16"/>
+        <w:sz w:val="18"/>
+        <w:szCs w:val="18"/>
       </w:rPr>
       <w:t xml:space="preserve">U.S. History Hack™ · Unit 6 Teacher Guide</w:t>
     </w:r>

</xml_diff>